<commit_message>
Lesson plan in the department's colours, linked live; posters no longer spill
The pre-CAT lesson is on the coloured table: purple header with the
unit and the lesson, green Engage, pink Develop and Discover, blue
Apply and Explore, yellow Review. Every resource named in it is a
hyperlink to the live site, so a republished file is what the plan
opens.

The A3 posters spilled to a second page in Word because each page
break sat in its own empty paragraph after the footer. The break now
rides inside the footer line, the open field is an exact-height row,
and 1500 twips are left for Word's own padding. Chapter tickets go
four across, one set a page. The quote-hunt rows are shorter so the
sheet stays one side.

Co-Authored-By: Claude Fable 5.1 <noreply@anthropic.com>
Claude-Session: https://claude.ai/code/session_01TX2KYiJGekMNoBBPASQh6e
</commit_message>
<xml_diff>
--- a/BoneSparrow-idea-posters.docx
+++ b/BoneSparrow-idea-posters.docx
@@ -19,7 +19,7 @@
       </w:tblGrid>
       <w:tr>
         <w:trPr>
-          <w:trHeight w:val="2600" w:hRule="atLeast"/>
+          <w:trHeight w:val="2400" w:hRule="atLeast"/>
         </w:trPr>
         <w:tc>
           <w:tcPr>
@@ -69,7 +69,7 @@
       </w:tr>
       <w:tr>
         <w:trPr>
-          <w:trHeight w:val="11938" w:hRule="atLeast"/>
+          <w:trHeight w:val="11338" w:hRule="exact"/>
         </w:trPr>
         <w:tc>
           <w:tcPr>
@@ -90,7 +90,7 @@
         <w:tabs>
           <w:tab w:val="right" w:pos="22211"/>
         </w:tabs>
-        <w:spacing w:after="0" w:before="120"/>
+        <w:spacing w:after="0" w:before="100"/>
       </w:pPr>
       <w:r>
         <w:rPr>
@@ -110,11 +110,6 @@
         </w:rPr>
         <w:t xml:space="preserve">	Every quote: the words, the chapter, your name.</w:t>
       </w:r>
-    </w:p>
-    <w:p>
-      <w:pPr>
-        <w:spacing w:after="0"/>
-      </w:pPr>
       <w:r>
         <w:br w:type="page"/>
       </w:r>
@@ -136,7 +131,7 @@
       </w:tblGrid>
       <w:tr>
         <w:trPr>
-          <w:trHeight w:val="2600" w:hRule="atLeast"/>
+          <w:trHeight w:val="2400" w:hRule="atLeast"/>
         </w:trPr>
         <w:tc>
           <w:tcPr>
@@ -186,7 +181,7 @@
       </w:tr>
       <w:tr>
         <w:trPr>
-          <w:trHeight w:val="11938" w:hRule="atLeast"/>
+          <w:trHeight w:val="11338" w:hRule="exact"/>
         </w:trPr>
         <w:tc>
           <w:tcPr>
@@ -207,7 +202,7 @@
         <w:tabs>
           <w:tab w:val="right" w:pos="22211"/>
         </w:tabs>
-        <w:spacing w:after="0" w:before="120"/>
+        <w:spacing w:after="0" w:before="100"/>
       </w:pPr>
       <w:r>
         <w:rPr>
@@ -227,11 +222,6 @@
         </w:rPr>
         <w:t xml:space="preserve">	Every quote: the words, the chapter, your name.</w:t>
       </w:r>
-    </w:p>
-    <w:p>
-      <w:pPr>
-        <w:spacing w:after="0"/>
-      </w:pPr>
       <w:r>
         <w:br w:type="page"/>
       </w:r>
@@ -253,7 +243,7 @@
       </w:tblGrid>
       <w:tr>
         <w:trPr>
-          <w:trHeight w:val="2600" w:hRule="atLeast"/>
+          <w:trHeight w:val="2400" w:hRule="atLeast"/>
         </w:trPr>
         <w:tc>
           <w:tcPr>
@@ -303,7 +293,7 @@
       </w:tr>
       <w:tr>
         <w:trPr>
-          <w:trHeight w:val="11938" w:hRule="atLeast"/>
+          <w:trHeight w:val="11338" w:hRule="exact"/>
         </w:trPr>
         <w:tc>
           <w:tcPr>
@@ -324,7 +314,7 @@
         <w:tabs>
           <w:tab w:val="right" w:pos="22211"/>
         </w:tabs>
-        <w:spacing w:after="0" w:before="120"/>
+        <w:spacing w:after="0" w:before="100"/>
       </w:pPr>
       <w:r>
         <w:rPr>
@@ -344,11 +334,6 @@
         </w:rPr>
         <w:t xml:space="preserve">	Every quote: the words, the chapter, your name.</w:t>
       </w:r>
-    </w:p>
-    <w:p>
-      <w:pPr>
-        <w:spacing w:after="0"/>
-      </w:pPr>
       <w:r>
         <w:br w:type="page"/>
       </w:r>
@@ -370,7 +355,7 @@
       </w:tblGrid>
       <w:tr>
         <w:trPr>
-          <w:trHeight w:val="2600" w:hRule="atLeast"/>
+          <w:trHeight w:val="2400" w:hRule="atLeast"/>
         </w:trPr>
         <w:tc>
           <w:tcPr>
@@ -420,7 +405,7 @@
       </w:tr>
       <w:tr>
         <w:trPr>
-          <w:trHeight w:val="11938" w:hRule="atLeast"/>
+          <w:trHeight w:val="11338" w:hRule="exact"/>
         </w:trPr>
         <w:tc>
           <w:tcPr>
@@ -441,7 +426,7 @@
         <w:tabs>
           <w:tab w:val="right" w:pos="22211"/>
         </w:tabs>
-        <w:spacing w:after="0" w:before="120"/>
+        <w:spacing w:after="0" w:before="100"/>
       </w:pPr>
       <w:r>
         <w:rPr>
@@ -461,11 +446,6 @@
         </w:rPr>
         <w:t xml:space="preserve">	Every quote: the words, the chapter, your name.</w:t>
       </w:r>
-    </w:p>
-    <w:p>
-      <w:pPr>
-        <w:spacing w:after="0"/>
-      </w:pPr>
       <w:r>
         <w:br w:type="page"/>
       </w:r>
@@ -487,7 +467,7 @@
       </w:tblGrid>
       <w:tr>
         <w:trPr>
-          <w:trHeight w:val="2600" w:hRule="atLeast"/>
+          <w:trHeight w:val="2400" w:hRule="atLeast"/>
         </w:trPr>
         <w:tc>
           <w:tcPr>
@@ -537,7 +517,7 @@
       </w:tr>
       <w:tr>
         <w:trPr>
-          <w:trHeight w:val="11938" w:hRule="atLeast"/>
+          <w:trHeight w:val="11338" w:hRule="exact"/>
         </w:trPr>
         <w:tc>
           <w:tcPr>
@@ -558,7 +538,7 @@
         <w:tabs>
           <w:tab w:val="right" w:pos="22211"/>
         </w:tabs>
-        <w:spacing w:after="0" w:before="120"/>
+        <w:spacing w:after="0" w:before="100"/>
       </w:pPr>
       <w:r>
         <w:rPr>
@@ -578,11 +558,6 @@
         </w:rPr>
         <w:t xml:space="preserve">	Every quote: the words, the chapter, your name.</w:t>
       </w:r>
-    </w:p>
-    <w:p>
-      <w:pPr>
-        <w:spacing w:after="0"/>
-      </w:pPr>
       <w:r>
         <w:br w:type="page"/>
       </w:r>
@@ -604,7 +579,7 @@
       </w:tblGrid>
       <w:tr>
         <w:trPr>
-          <w:trHeight w:val="2600" w:hRule="atLeast"/>
+          <w:trHeight w:val="2400" w:hRule="atLeast"/>
         </w:trPr>
         <w:tc>
           <w:tcPr>
@@ -654,7 +629,7 @@
       </w:tr>
       <w:tr>
         <w:trPr>
-          <w:trHeight w:val="11938" w:hRule="atLeast"/>
+          <w:trHeight w:val="11338" w:hRule="exact"/>
         </w:trPr>
         <w:tc>
           <w:tcPr>
@@ -675,7 +650,7 @@
         <w:tabs>
           <w:tab w:val="right" w:pos="22211"/>
         </w:tabs>
-        <w:spacing w:after="0" w:before="120"/>
+        <w:spacing w:after="0" w:before="100"/>
       </w:pPr>
       <w:r>
         <w:rPr>

</xml_diff>